<commit_message>
Completed SNF analysis and report
</commit_message>
<xml_diff>
--- a/Results/single_algorithm/SNF/Supplement/TABLE Independent test between subtype and mutation.docx
+++ b/Results/single_algorithm/SNF/Supplement/TABLE Independent test between subtype and mutation.docx
@@ -68,16 +68,6 @@
               <w:pStyle w:stlname="Normal" w:val="Normal"/>
             </w:pPr>
             <w:r>
-              <w:t>SNF3</w:t>
-            </w:r>
-          </w:p>
-        </w:tc>
-        <w:tc>
-          <w:p>
-            <w:pPr>
-              <w:pStyle w:stlname="Normal" w:val="Normal"/>
-            </w:pPr>
-            <w:r>
               <w:t>pvalue</w:t>
             </w:r>
           </w:p>
@@ -120,7 +110,7 @@
               <w:pStyle w:stlname="Normal" w:val="Normal"/>
             </w:pPr>
             <w:r>
-              <w:t>47 (9.4%)</w:t>
+              <w:t>47 (9.2%)</w:t>
             </w:r>
           </w:p>
         </w:tc>
@@ -140,27 +130,17 @@
               <w:pStyle w:stlname="Normal" w:val="Normal"/>
             </w:pPr>
             <w:r>
-              <w:t>0 (0.0%)</w:t>
-            </w:r>
-          </w:p>
-        </w:tc>
-        <w:tc>
-          <w:p>
-            <w:pPr>
-              <w:pStyle w:stlname="Normal" w:val="Normal"/>
-            </w:pPr>
-            <w:r>
-              <w:t>1.15e-02</w:t>
-            </w:r>
-          </w:p>
-        </w:tc>
-        <w:tc>
-          <w:p>
-            <w:pPr>
-              <w:pStyle w:stlname="Normal" w:val="Normal"/>
-            </w:pPr>
-            <w:r>
-              <w:t>1.92e-02</w:t>
+              <w:t>2.01e-02</w:t>
+            </w:r>
+          </w:p>
+        </w:tc>
+        <w:tc>
+          <w:p>
+            <w:pPr>
+              <w:pStyle w:stlname="Normal" w:val="Normal"/>
+            </w:pPr>
+            <w:r>
+              <w:t>6.40e-02</w:t>
             </w:r>
           </w:p>
         </w:tc>
@@ -182,57 +162,47 @@
               <w:pStyle w:stlname="Normal" w:val="Normal"/>
             </w:pPr>
             <w:r>
-              <w:t>35 ( 5%)</w:t>
-            </w:r>
-          </w:p>
-        </w:tc>
-        <w:tc>
-          <w:p>
-            <w:pPr>
-              <w:pStyle w:stlname="Normal" w:val="Normal"/>
-            </w:pPr>
-            <w:r>
-              <w:t>21 ( 4.2%)</w:t>
-            </w:r>
-          </w:p>
-        </w:tc>
-        <w:tc>
-          <w:p>
-            <w:pPr>
-              <w:pStyle w:stlname="Normal" w:val="Normal"/>
-            </w:pPr>
-            <w:r>
-              <w:t>11 ( 9.8%)</w:t>
-            </w:r>
-          </w:p>
-        </w:tc>
-        <w:tc>
-          <w:p>
-            <w:pPr>
-              <w:pStyle w:stlname="Normal" w:val="Normal"/>
-            </w:pPr>
-            <w:r>
-              <w:t>3 (10.0%)</w:t>
-            </w:r>
-          </w:p>
-        </w:tc>
-        <w:tc>
-          <w:p>
-            <w:pPr>
-              <w:pStyle w:stlname="Normal" w:val="Normal"/>
-            </w:pPr>
-            <w:r>
-              <w:t>2.42e-02</w:t>
-            </w:r>
-          </w:p>
-        </w:tc>
-        <w:tc>
-          <w:p>
-            <w:pPr>
-              <w:pStyle w:stlname="Normal" w:val="Normal"/>
-            </w:pPr>
-            <w:r>
-              <w:t>3.46e-02</w:t>
+              <w:t>34 ( 5%)</w:t>
+            </w:r>
+          </w:p>
+        </w:tc>
+        <w:tc>
+          <w:p>
+            <w:pPr>
+              <w:pStyle w:stlname="Normal" w:val="Normal"/>
+            </w:pPr>
+            <w:r>
+              <w:t>24 (4.7%)</w:t>
+            </w:r>
+          </w:p>
+        </w:tc>
+        <w:tc>
+          <w:p>
+            <w:pPr>
+              <w:pStyle w:stlname="Normal" w:val="Normal"/>
+            </w:pPr>
+            <w:r>
+              <w:t>10 (8.9%)</w:t>
+            </w:r>
+          </w:p>
+        </w:tc>
+        <w:tc>
+          <w:p>
+            <w:pPr>
+              <w:pStyle w:stlname="Normal" w:val="Normal"/>
+            </w:pPr>
+            <w:r>
+              <w:t>1.03e-01</w:t>
+            </w:r>
+          </w:p>
+        </w:tc>
+        <w:tc>
+          <w:p>
+            <w:pPr>
+              <w:pStyle w:stlname="Normal" w:val="Normal"/>
+            </w:pPr>
+            <w:r>
+              <w:t>1.72e-01</w:t>
             </w:r>
           </w:p>
         </w:tc>
@@ -254,57 +224,47 @@
               <w:pStyle w:stlname="Normal" w:val="Normal"/>
             </w:pPr>
             <w:r>
-              <w:t>36 ( 6%)</w:t>
-            </w:r>
-          </w:p>
-        </w:tc>
-        <w:tc>
-          <w:p>
-            <w:pPr>
-              <w:pStyle w:stlname="Normal" w:val="Normal"/>
-            </w:pPr>
-            <w:r>
-              <w:t>25 ( 5.0%)</w:t>
-            </w:r>
-          </w:p>
-        </w:tc>
-        <w:tc>
-          <w:p>
-            <w:pPr>
-              <w:pStyle w:stlname="Normal" w:val="Normal"/>
-            </w:pPr>
-            <w:r>
-              <w:t>8 ( 7.1%)</w:t>
-            </w:r>
-          </w:p>
-        </w:tc>
-        <w:tc>
-          <w:p>
-            <w:pPr>
-              <w:pStyle w:stlname="Normal" w:val="Normal"/>
-            </w:pPr>
-            <w:r>
-              <w:t>3 (10.0%)</w:t>
-            </w:r>
-          </w:p>
-        </w:tc>
-        <w:tc>
-          <w:p>
-            <w:pPr>
-              <w:pStyle w:stlname="Normal" w:val="Normal"/>
-            </w:pPr>
-            <w:r>
-              <w:t>2.46e-01</w:t>
-            </w:r>
-          </w:p>
-        </w:tc>
-        <w:tc>
-          <w:p>
-            <w:pPr>
-              <w:pStyle w:stlname="Normal" w:val="Normal"/>
-            </w:pPr>
-            <w:r>
-              <w:t>2.46e-01</w:t>
+              <w:t>34 ( 5%)</w:t>
+            </w:r>
+          </w:p>
+        </w:tc>
+        <w:tc>
+          <w:p>
+            <w:pPr>
+              <w:pStyle w:stlname="Normal" w:val="Normal"/>
+            </w:pPr>
+            <w:r>
+              <w:t>26 (5.1%)</w:t>
+            </w:r>
+          </w:p>
+        </w:tc>
+        <w:tc>
+          <w:p>
+            <w:pPr>
+              <w:pStyle w:stlname="Normal" w:val="Normal"/>
+            </w:pPr>
+            <w:r>
+              <w:t>8 (7.1%)</w:t>
+            </w:r>
+          </w:p>
+        </w:tc>
+        <w:tc>
+          <w:p>
+            <w:pPr>
+              <w:pStyle w:stlname="Normal" w:val="Normal"/>
+            </w:pPr>
+            <w:r>
+              <w:t>3.62e-01</w:t>
+            </w:r>
+          </w:p>
+        </w:tc>
+        <w:tc>
+          <w:p>
+            <w:pPr>
+              <w:pStyle w:stlname="Normal" w:val="Normal"/>
+            </w:pPr>
+            <w:r>
+              <w:t>4.02e-01</w:t>
             </w:r>
           </w:p>
         </w:tc>
@@ -326,57 +286,47 @@
               <w:pStyle w:stlname="Normal" w:val="Normal"/>
             </w:pPr>
             <w:r>
-              <w:t>45 ( 7%)</w:t>
-            </w:r>
-          </w:p>
-        </w:tc>
-        <w:tc>
-          <w:p>
-            <w:pPr>
-              <w:pStyle w:stlname="Normal" w:val="Normal"/>
-            </w:pPr>
-            <w:r>
-              <w:t>37 ( 7.4%)</w:t>
-            </w:r>
-          </w:p>
-        </w:tc>
-        <w:tc>
-          <w:p>
-            <w:pPr>
-              <w:pStyle w:stlname="Normal" w:val="Normal"/>
-            </w:pPr>
-            <w:r>
-              <w:t>4 ( 3.6%)</w:t>
-            </w:r>
-          </w:p>
-        </w:tc>
-        <w:tc>
-          <w:p>
-            <w:pPr>
-              <w:pStyle w:stlname="Normal" w:val="Normal"/>
-            </w:pPr>
-            <w:r>
-              <w:t>4 (13.3%)</w:t>
-            </w:r>
-          </w:p>
-        </w:tc>
-        <w:tc>
-          <w:p>
-            <w:pPr>
-              <w:pStyle w:stlname="Normal" w:val="Normal"/>
-            </w:pPr>
-            <w:r>
-              <w:t>1.29e-01</w:t>
-            </w:r>
-          </w:p>
-        </w:tc>
-        <w:tc>
-          <w:p>
-            <w:pPr>
-              <w:pStyle w:stlname="Normal" w:val="Normal"/>
-            </w:pPr>
-            <w:r>
-              <w:t>1.43e-01</w:t>
+              <w:t>43 ( 7%)</w:t>
+            </w:r>
+          </w:p>
+        </w:tc>
+        <w:tc>
+          <w:p>
+            <w:pPr>
+              <w:pStyle w:stlname="Normal" w:val="Normal"/>
+            </w:pPr>
+            <w:r>
+              <w:t>38 (7.4%)</w:t>
+            </w:r>
+          </w:p>
+        </w:tc>
+        <w:tc>
+          <w:p>
+            <w:pPr>
+              <w:pStyle w:stlname="Normal" w:val="Normal"/>
+            </w:pPr>
+            <w:r>
+              <w:t>5 (4.5%)</w:t>
+            </w:r>
+          </w:p>
+        </w:tc>
+        <w:tc>
+          <w:p>
+            <w:pPr>
+              <w:pStyle w:stlname="Normal" w:val="Normal"/>
+            </w:pPr>
+            <w:r>
+              <w:t>3.10e-01</w:t>
+            </w:r>
+          </w:p>
+        </w:tc>
+        <w:tc>
+          <w:p>
+            <w:pPr>
+              <w:pStyle w:stlname="Normal" w:val="Normal"/>
+            </w:pPr>
+            <w:r>
+              <w:t>3.88e-01</w:t>
             </w:r>
           </w:p>
         </w:tc>
@@ -398,57 +348,47 @@
               <w:pStyle w:stlname="Normal" w:val="Normal"/>
             </w:pPr>
             <w:r>
-              <w:t>63 (10%)</w:t>
-            </w:r>
-          </w:p>
-        </w:tc>
-        <w:tc>
-          <w:p>
-            <w:pPr>
-              <w:pStyle w:stlname="Normal" w:val="Normal"/>
-            </w:pPr>
-            <w:r>
-              <w:t>40 ( 8.0%)</w:t>
-            </w:r>
-          </w:p>
-        </w:tc>
-        <w:tc>
-          <w:p>
-            <w:pPr>
-              <w:pStyle w:stlname="Normal" w:val="Normal"/>
-            </w:pPr>
-            <w:r>
-              <w:t>15 (13.4%)</w:t>
-            </w:r>
-          </w:p>
-        </w:tc>
-        <w:tc>
-          <w:p>
-            <w:pPr>
-              <w:pStyle w:stlname="Normal" w:val="Normal"/>
-            </w:pPr>
-            <w:r>
-              <w:t>8 (26.7%)</w:t>
-            </w:r>
-          </w:p>
-        </w:tc>
-        <w:tc>
-          <w:p>
-            <w:pPr>
-              <w:pStyle w:stlname="Normal" w:val="Normal"/>
-            </w:pPr>
-            <w:r>
-              <w:t>2.56e-03</w:t>
-            </w:r>
-          </w:p>
-        </w:tc>
-        <w:tc>
-          <w:p>
-            <w:pPr>
-              <w:pStyle w:stlname="Normal" w:val="Normal"/>
-            </w:pPr>
-            <w:r>
-              <w:t>5.12e-03</w:t>
+              <w:t>61 (10%)</w:t>
+            </w:r>
+          </w:p>
+        </w:tc>
+        <w:tc>
+          <w:p>
+            <w:pPr>
+              <w:pStyle w:stlname="Normal" w:val="Normal"/>
+            </w:pPr>
+            <w:r>
+              <w:t>47 ( 9.2%)</w:t>
+            </w:r>
+          </w:p>
+        </w:tc>
+        <w:tc>
+          <w:p>
+            <w:pPr>
+              <w:pStyle w:stlname="Normal" w:val="Normal"/>
+            </w:pPr>
+            <w:r>
+              <w:t>14 (12.5%)</w:t>
+            </w:r>
+          </w:p>
+        </w:tc>
+        <w:tc>
+          <w:p>
+            <w:pPr>
+              <w:pStyle w:stlname="Normal" w:val="Normal"/>
+            </w:pPr>
+            <w:r>
+              <w:t>2.92e-01</w:t>
+            </w:r>
+          </w:p>
+        </w:tc>
+        <w:tc>
+          <w:p>
+            <w:pPr>
+              <w:pStyle w:stlname="Normal" w:val="Normal"/>
+            </w:pPr>
+            <w:r>
+              <w:t>3.88e-01</w:t>
             </w:r>
           </w:p>
         </w:tc>
@@ -470,57 +410,47 @@
               <w:pStyle w:stlname="Normal" w:val="Normal"/>
             </w:pPr>
             <w:r>
-              <w:t>208 (32%)</w:t>
-            </w:r>
-          </w:p>
-        </w:tc>
-        <w:tc>
-          <w:p>
-            <w:pPr>
-              <w:pStyle w:stlname="Normal" w:val="Normal"/>
-            </w:pPr>
-            <w:r>
-              <w:t>196 (39.0%)</w:t>
-            </w:r>
-          </w:p>
-        </w:tc>
-        <w:tc>
-          <w:p>
-            <w:pPr>
-              <w:pStyle w:stlname="Normal" w:val="Normal"/>
-            </w:pPr>
-            <w:r>
-              <w:t>4 ( 3.6%)</w:t>
-            </w:r>
-          </w:p>
-        </w:tc>
-        <w:tc>
-          <w:p>
-            <w:pPr>
-              <w:pStyle w:stlname="Normal" w:val="Normal"/>
-            </w:pPr>
-            <w:r>
-              <w:t>8 (26.7%)</w:t>
-            </w:r>
-          </w:p>
-        </w:tc>
-        <w:tc>
-          <w:p>
-            <w:pPr>
-              <w:pStyle w:stlname="Normal" w:val="Normal"/>
-            </w:pPr>
-            <w:r>
-              <w:t>1.20e-15</w:t>
-            </w:r>
-          </w:p>
-        </w:tc>
-        <w:tc>
-          <w:p>
-            <w:pPr>
-              <w:pStyle w:stlname="Normal" w:val="Normal"/>
-            </w:pPr>
-            <w:r>
-              <w:t>6.00e-15</w:t>
+              <w:t>205 (33%)</w:t>
+            </w:r>
+          </w:p>
+        </w:tc>
+        <w:tc>
+          <w:p>
+            <w:pPr>
+              <w:pStyle w:stlname="Normal" w:val="Normal"/>
+            </w:pPr>
+            <w:r>
+              <w:t>199 (38.8%)</w:t>
+            </w:r>
+          </w:p>
+        </w:tc>
+        <w:tc>
+          <w:p>
+            <w:pPr>
+              <w:pStyle w:stlname="Normal" w:val="Normal"/>
+            </w:pPr>
+            <w:r>
+              <w:t>6 ( 5.4%)</w:t>
+            </w:r>
+          </w:p>
+        </w:tc>
+        <w:tc>
+          <w:p>
+            <w:pPr>
+              <w:pStyle w:stlname="Normal" w:val="Normal"/>
+            </w:pPr>
+            <w:r>
+              <w:t>6.23e-14</w:t>
+            </w:r>
+          </w:p>
+        </w:tc>
+        <w:tc>
+          <w:p>
+            <w:pPr>
+              <w:pStyle w:stlname="Normal" w:val="Normal"/>
+            </w:pPr>
+            <w:r>
+              <w:t>3.11e-13</w:t>
             </w:r>
           </w:p>
         </w:tc>
@@ -542,57 +472,47 @@
               <w:pStyle w:stlname="Normal" w:val="Normal"/>
             </w:pPr>
             <w:r>
-              <w:t>40 ( 6%)</w:t>
-            </w:r>
-          </w:p>
-        </w:tc>
-        <w:tc>
-          <w:p>
-            <w:pPr>
-              <w:pStyle w:stlname="Normal" w:val="Normal"/>
-            </w:pPr>
-            <w:r>
-              <w:t>20 ( 4.0%)</w:t>
-            </w:r>
-          </w:p>
-        </w:tc>
-        <w:tc>
-          <w:p>
-            <w:pPr>
-              <w:pStyle w:stlname="Normal" w:val="Normal"/>
-            </w:pPr>
-            <w:r>
-              <w:t>12 (10.7%)</w:t>
-            </w:r>
-          </w:p>
-        </w:tc>
-        <w:tc>
-          <w:p>
-            <w:pPr>
-              <w:pStyle w:stlname="Normal" w:val="Normal"/>
-            </w:pPr>
-            <w:r>
-              <w:t>8 (26.7%)</w:t>
-            </w:r>
-          </w:p>
-        </w:tc>
-        <w:tc>
-          <w:p>
-            <w:pPr>
-              <w:pStyle w:stlname="Normal" w:val="Normal"/>
-            </w:pPr>
-            <w:r>
-              <w:t>1.10e-05</w:t>
-            </w:r>
-          </w:p>
-        </w:tc>
-        <w:tc>
-          <w:p>
-            <w:pPr>
-              <w:pStyle w:stlname="Normal" w:val="Normal"/>
-            </w:pPr>
-            <w:r>
-              <w:t>2.75e-05</w:t>
+              <w:t>38 ( 6%)</w:t>
+            </w:r>
+          </w:p>
+        </w:tc>
+        <w:tc>
+          <w:p>
+            <w:pPr>
+              <w:pStyle w:stlname="Normal" w:val="Normal"/>
+            </w:pPr>
+            <w:r>
+              <w:t>27 (5.3%)</w:t>
+            </w:r>
+          </w:p>
+        </w:tc>
+        <w:tc>
+          <w:p>
+            <w:pPr>
+              <w:pStyle w:stlname="Normal" w:val="Normal"/>
+            </w:pPr>
+            <w:r>
+              <w:t>11 (9.8%)</w:t>
+            </w:r>
+          </w:p>
+        </w:tc>
+        <w:tc>
+          <w:p>
+            <w:pPr>
+              <w:pStyle w:stlname="Normal" w:val="Normal"/>
+            </w:pPr>
+            <w:r>
+              <w:t>7.98e-02</w:t>
+            </w:r>
+          </w:p>
+        </w:tc>
+        <w:tc>
+          <w:p>
+            <w:pPr>
+              <w:pStyle w:stlname="Normal" w:val="Normal"/>
+            </w:pPr>
+            <w:r>
+              <w:t>1.60e-01</w:t>
             </w:r>
           </w:p>
         </w:tc>
@@ -624,47 +544,37 @@
               <w:pStyle w:stlname="Normal" w:val="Normal"/>
             </w:pPr>
             <w:r>
-              <w:t>24 ( 4.8%)</w:t>
-            </w:r>
-          </w:p>
-        </w:tc>
-        <w:tc>
-          <w:p>
-            <w:pPr>
-              <w:pStyle w:stlname="Normal" w:val="Normal"/>
-            </w:pPr>
-            <w:r>
-              <w:t>10 ( 8.9%)</w:t>
-            </w:r>
-          </w:p>
-        </w:tc>
-        <w:tc>
-          <w:p>
-            <w:pPr>
-              <w:pStyle w:stlname="Normal" w:val="Normal"/>
-            </w:pPr>
-            <w:r>
-              <w:t>3 (10.0%)</w:t>
-            </w:r>
-          </w:p>
-        </w:tc>
-        <w:tc>
-          <w:p>
-            <w:pPr>
-              <w:pStyle w:stlname="Normal" w:val="Normal"/>
-            </w:pPr>
-            <w:r>
-              <w:t>9.43e-02</w:t>
-            </w:r>
-          </w:p>
-        </w:tc>
-        <w:tc>
-          <w:p>
-            <w:pPr>
-              <w:pStyle w:stlname="Normal" w:val="Normal"/>
-            </w:pPr>
-            <w:r>
-              <w:t>1.18e-01</w:t>
+              <w:t>25 ( 4.9%)</w:t>
+            </w:r>
+          </w:p>
+        </w:tc>
+        <w:tc>
+          <w:p>
+            <w:pPr>
+              <w:pStyle w:stlname="Normal" w:val="Normal"/>
+            </w:pPr>
+            <w:r>
+              <w:t>12 (10.7%)</w:t>
+            </w:r>
+          </w:p>
+        </w:tc>
+        <w:tc>
+          <w:p>
+            <w:pPr>
+              <w:pStyle w:stlname="Normal" w:val="Normal"/>
+            </w:pPr>
+            <w:r>
+              <w:t>2.56e-02</w:t>
+            </w:r>
+          </w:p>
+        </w:tc>
+        <w:tc>
+          <w:p>
+            <w:pPr>
+              <w:pStyle w:stlname="Normal" w:val="Normal"/>
+            </w:pPr>
+            <w:r>
+              <w:t>6.40e-02</w:t>
             </w:r>
           </w:p>
         </w:tc>
@@ -686,57 +596,47 @@
               <w:pStyle w:stlname="Normal" w:val="Normal"/>
             </w:pPr>
             <w:r>
-              <w:t>172 (27%)</w:t>
-            </w:r>
-          </w:p>
-        </w:tc>
-        <w:tc>
-          <w:p>
-            <w:pPr>
-              <w:pStyle w:stlname="Normal" w:val="Normal"/>
-            </w:pPr>
-            <w:r>
-              <w:t>80 (15.9%)</w:t>
-            </w:r>
-          </w:p>
-        </w:tc>
-        <w:tc>
-          <w:p>
-            <w:pPr>
-              <w:pStyle w:stlname="Normal" w:val="Normal"/>
-            </w:pPr>
-            <w:r>
-              <w:t>77 (68.8%)</w:t>
-            </w:r>
-          </w:p>
-        </w:tc>
-        <w:tc>
-          <w:p>
-            <w:pPr>
-              <w:pStyle w:stlname="Normal" w:val="Normal"/>
-            </w:pPr>
-            <w:r>
-              <w:t>15 (50.0%)</w:t>
-            </w:r>
-          </w:p>
-        </w:tc>
-        <w:tc>
-          <w:p>
-            <w:pPr>
-              <w:pStyle w:stlname="Normal" w:val="Normal"/>
-            </w:pPr>
-            <w:r>
-              <w:t>9.78e-29</w:t>
-            </w:r>
-          </w:p>
-        </w:tc>
-        <w:tc>
-          <w:p>
-            <w:pPr>
-              <w:pStyle w:stlname="Normal" w:val="Normal"/>
-            </w:pPr>
-            <w:r>
-              <w:t>9.78e-28</w:t>
+              <w:t>171 (27%)</w:t>
+            </w:r>
+          </w:p>
+        </w:tc>
+        <w:tc>
+          <w:p>
+            <w:pPr>
+              <w:pStyle w:stlname="Normal" w:val="Normal"/>
+            </w:pPr>
+            <w:r>
+              <w:t>97 (18.9%)</w:t>
+            </w:r>
+          </w:p>
+        </w:tc>
+        <w:tc>
+          <w:p>
+            <w:pPr>
+              <w:pStyle w:stlname="Normal" w:val="Normal"/>
+            </w:pPr>
+            <w:r>
+              <w:t>74 (66.1%)</w:t>
+            </w:r>
+          </w:p>
+        </w:tc>
+        <w:tc>
+          <w:p>
+            <w:pPr>
+              <w:pStyle w:stlname="Normal" w:val="Normal"/>
+            </w:pPr>
+            <w:r>
+              <w:t>9.16e-22</w:t>
+            </w:r>
+          </w:p>
+        </w:tc>
+        <w:tc>
+          <w:p>
+            <w:pPr>
+              <w:pStyle w:stlname="Normal" w:val="Normal"/>
+            </w:pPr>
+            <w:r>
+              <w:t>9.16e-21</w:t>
             </w:r>
           </w:p>
         </w:tc>
@@ -758,57 +658,47 @@
               <w:pStyle w:stlname="Normal" w:val="Normal"/>
             </w:pPr>
             <w:r>
-              <w:t>107 (17%)</w:t>
-            </w:r>
-          </w:p>
-        </w:tc>
-        <w:tc>
-          <w:p>
-            <w:pPr>
-              <w:pStyle w:stlname="Normal" w:val="Normal"/>
-            </w:pPr>
-            <w:r>
-              <w:t>72 (14.3%)</w:t>
-            </w:r>
-          </w:p>
-        </w:tc>
-        <w:tc>
-          <w:p>
-            <w:pPr>
-              <w:pStyle w:stlname="Normal" w:val="Normal"/>
-            </w:pPr>
-            <w:r>
-              <w:t>19 (17.0%)</w:t>
-            </w:r>
-          </w:p>
-        </w:tc>
-        <w:tc>
-          <w:p>
-            <w:pPr>
-              <w:pStyle w:stlname="Normal" w:val="Normal"/>
-            </w:pPr>
-            <w:r>
-              <w:t>16 (53.3%)</w:t>
-            </w:r>
-          </w:p>
-        </w:tc>
-        <w:tc>
-          <w:p>
-            <w:pPr>
-              <w:pStyle w:stlname="Normal" w:val="Normal"/>
-            </w:pPr>
-            <w:r>
-              <w:t>5.21e-06</w:t>
-            </w:r>
-          </w:p>
-        </w:tc>
-        <w:tc>
-          <w:p>
-            <w:pPr>
-              <w:pStyle w:stlname="Normal" w:val="Normal"/>
-            </w:pPr>
-            <w:r>
-              <w:t>1.74e-05</w:t>
+              <w:t>102 (16%)</w:t>
+            </w:r>
+          </w:p>
+        </w:tc>
+        <w:tc>
+          <w:p>
+            <w:pPr>
+              <w:pStyle w:stlname="Normal" w:val="Normal"/>
+            </w:pPr>
+            <w:r>
+              <w:t>81 (15.8%)</w:t>
+            </w:r>
+          </w:p>
+        </w:tc>
+        <w:tc>
+          <w:p>
+            <w:pPr>
+              <w:pStyle w:stlname="Normal" w:val="Normal"/>
+            </w:pPr>
+            <w:r>
+              <w:t>21 (18.8%)</w:t>
+            </w:r>
+          </w:p>
+        </w:tc>
+        <w:tc>
+          <w:p>
+            <w:pPr>
+              <w:pStyle w:stlname="Normal" w:val="Normal"/>
+            </w:pPr>
+            <w:r>
+              <w:t>4.80e-01</w:t>
+            </w:r>
+          </w:p>
+        </w:tc>
+        <w:tc>
+          <w:p>
+            <w:pPr>
+              <w:pStyle w:stlname="Normal" w:val="Normal"/>
+            </w:pPr>
+            <w:r>
+              <w:t>4.80e-01</w:t>
             </w:r>
           </w:p>
         </w:tc>

</xml_diff>